<commit_message>
docs: registra ADR 002 sobre atualização incremental dos indicadores
</commit_message>
<xml_diff>
--- a/docs/decisoes-arquiteturais.docx
+++ b/docs/decisoes-arquiteturais.docx
@@ -12,7 +12,7 @@
     </w:p>
     <w:p>
       <w:r>
-        <w:t>Versão 1.0  |  27 de outubro de 2026</w:t>
+        <w:t>Versão 1.1  |  27 de outubro de 2026</w:t>
       </w:r>
     </w:p>
     <w:p>
@@ -30,7 +30,7 @@
     </w:p>
     <w:p>
       <w:r>
-        <w:t>Cada nova decisão deve receber um identificador sequencial, data, estado, contexto, decisão, consequências e evidências. Revisões devem preservar o histórico: quando uma decisão for substituída, registrar a sucessora e a relação entre elas. O registro atual contém a ADR 001; novas decisões serão acrescentadas a este documento.</w:t>
+        <w:t>Cada nova decisão deve receber um identificador sequencial, data, estado, contexto, decisão, consequências e evidências. Revisões devem preservar o histórico: quando uma decisão for substituída, registrar a sucessora e a relação entre elas. O registro contém a ADR 001 e a ADR 002. A ADR 002 substitui a leitura integral recorrente descrita na implementação inicial da ADR 001; a consulta passiva pelo frontend permanece vigente.</w:t>
       </w:r>
     </w:p>
     <w:p>
@@ -264,7 +264,7 @@
         <w:pStyle w:val="ListBullet"/>
       </w:pPr>
       <w:r>
-        <w:t>A implementação atual relê integralmente o histórico necessário a cada ciclo. O custo de banco, CPU e memória temporária cresce com o número de pings da janela; não houve certificação de capacidade em produção nesta alteração.</w:t>
+        <w:t>Na implementação inicial da ADR 001, o processo relia integralmente o histórico necessário a cada ciclo. O custo de banco, CPU e memória temporária cresce com o número de pings da janela; não houve certificação de capacidade em produção nesta alteração.</w:t>
       </w:r>
     </w:p>
     <w:p>
@@ -325,6 +325,95 @@
     <w:p>
       <w:r>
         <w:t>Os arquivos de implementação ficam em src/main/java/br/com/scriptping. As evidências automatizadas ficam em src/test/java/br/com/scriptping, incluindo PacketLossCacheTests e PacketLossHistoryIntegrationTests. A descrição operacional está no README.md.</w:t>
+      </w:r>
+    </w:p>
+    <w:p>
+      <w:r>
+        <w:br w:type="page"/>
+      </w:r>
+    </w:p>
+    <w:p>
+      <w:pPr>
+        <w:pStyle w:val="Heading1"/>
+      </w:pPr>
+      <w:r>
+        <w:t>ADR 002 Atualização incremental dos indicadores</w:t>
+      </w:r>
+    </w:p>
+    <w:p>
+      <w:r>
+        <w:t>Data da decisão: 27 de outubro de 2026.</w:t>
+        <w:br/>
+        <w:t>Estado: aceita e implementada no código local. Implantação não realizada nesta alteração.</w:t>
+        <w:br/>
+        <w:t>Relação: substitui a leitura integral recorrente da ADR 001, preservando o ciclo de 10 segundos e a leitura dos indicadores disponíveis pelo frontend.</w:t>
+      </w:r>
+    </w:p>
+    <w:p>
+      <w:pPr>
+        <w:pStyle w:val="Heading2"/>
+      </w:pPr>
+      <w:r>
+        <w:t>Contexto e decisão</w:t>
+      </w:r>
+    </w:p>
+    <w:p>
+      <w:r>
+        <w:t>Com 700 hosts e um ping por segundo, uma janela de 8 horas contém 20.160.000 registros. Relê-los a cada 10 segundos repete o processamento de todo o histórico para incorporar aproximadamente 7.000 novos pings. A decisão é carregar o histórico inicialmente e manter o estado em memória, buscando somente registros novos nos ciclos seguintes.</w:t>
+      </w:r>
+    </w:p>
+    <w:p>
+      <w:pPr>
+        <w:pStyle w:val="Heading2"/>
+      </w:pPr>
+      <w:r>
+        <w:t>Acumuladores e histórico</w:t>
+      </w:r>
+    </w:p>
+    <w:p>
+      <w:r>
+        <w:t>Cada host e IP mantém somas de latência e contagens de respostas e perdas por janela. Novos pings acrescentam suas contribuições às janelas elegíveis; o avanço do horário retira as contribuições vencidas, mesmo sem novas gravações. O histórico usa blocos compactos de até 256 registros, com resumos reutilizáveis. A cobertura e as sequências de perda são obtidas desses resumos e dos registros nas bordas, preservando os diagnósticos existentes.</w:t>
+      </w:r>
+    </w:p>
+    <w:p>
+      <w:r>
+        <w:t>Pings atrasados são posicionados pelo horário de medição e entram somente nas janelas pertinentes. Pings futuros permanecem pendentes até seu horário. O histórico vencido é removido da memória; médias e percentuais são derivados dos acumuladores atualizados.</w:t>
+      </w:r>
+    </w:p>
+    <w:p>
+      <w:pPr>
+        <w:pStyle w:val="Heading2"/>
+      </w:pPr>
+      <w:r>
+        <w:t>Cursor e concorrência</w:t>
+      </w:r>
+    </w:p>
+    <w:p>
+      <w:r>
+        <w:t>Os escritores da aplicação bloqueiam a linha de ping_ingestion_guard antes de alocar IDs e a mantêm até o commit. O processo de indicadores usa esse mesmo bloqueio brevemente para capturar o maior ID confirmado. Depois libera o bloqueio e consulta IDs acima do cursor anterior até esse limite, respeitando a retenção necessária. Assim, uma gravação pendente não pode aparecer posteriormente com ID menor que um limite já processado.</w:t>
+      </w:r>
+    </w:p>
+    <w:p>
+      <w:r>
+        <w:t>O protocolo serializa os escritores e exige que inserções externas também o respeitem. A leitura extensa do histórico ocorre fora desse bloqueio. Os registros são imutáveis durante o processamento; alteração direta de pings existentes e reutilização de IDs não fazem parte do contrato incremental.</w:t>
+      </w:r>
+    </w:p>
+    <w:p>
+      <w:pPr>
+        <w:pStyle w:val="Heading2"/>
+      </w:pPr>
+      <w:r>
+        <w:t>Falhas e validação</w:t>
+      </w:r>
+    </w:p>
+    <w:p>
+      <w:r>
+        <w:t>O cursor avança somente após a conclusão do ciclo, e a publicação dos indicadores continua atômica. Se houver falha parcial, o resultado publicado é preservado e o estado de trabalho é descartado; o próximo ciclo faz uma nova carga inicial. Reinício ou retrocesso do relógio também exigem reconstrução. Não foram acrescentados logs nesta implementação.</w:t>
+      </w:r>
+    </w:p>
+    <w:p>
+      <w:r>
+        <w:t>A validação automatizada cobre equivalência com o cálculo completo, entradas e expirações, registros atrasados e futuros, erros de coleta, concorrência de gravação e recuperação sem duplicação. A redução do trabalho recorrente não certifica capacidade em produção: memória, consulta inicial e tempo dos ciclos continuam sujeitos à carga real.</w:t>
       </w:r>
     </w:p>
     <w:sectPr>

</xml_diff>